<commit_message>
Incorpora observações da revisão: garantia, PNCP, DDI, achados 7, 11 e 12
Co-Authored-By: Claude Sonnet 5.5 <noreply@anthropic.com>
Claude-Session: https://claude.ai/code/session_019hKSviCnF5ihoMnErm9Cu3
</commit_message>
<xml_diff>
--- a/Posicionamento_ASSGER_POP_Contratacao_Direta.docx
+++ b/Posicionamento_ASSGER_POP_Contratacao_Direta.docx
@@ -151,7 +151,7 @@
           <w:sz w:val="20"/>
           <w:szCs w:val="20"/>
         </w:rPr>
-        <w:t xml:space="preserve">A ASSGER recomenda que a proposta não seja aprovada na forma atual. Há sete pontos que a proposta introduz ou agrava (seção 2) e oito pontos que o POP vigente já não atende e que a proposta mantém (seção 3). Recomenda-se corrigir todos na mesma revisão. Os demais pontos foram testados e não apresentam divergência com as normas vigentes.</w:t>
+        <w:t xml:space="preserve">A ASSGER recomenda que a proposta não seja aprovada na forma atual. Há oito pontos que a proposta introduz ou agrava (seção 2) e onze pontos que o POP vigente já não atende e que a proposta mantém (seção 3). Recomenda-se corrigir todos na mesma revisão. Os demais pontos foram testados e não apresentam divergência com as normas vigentes.</w:t>
       </w:r>
     </w:p>
     <w:p>
@@ -174,7 +174,7 @@
           <w:sz w:val="20"/>
           <w:szCs w:val="20"/>
         </w:rPr>
-        <w:t xml:space="preserve">consulta a SIGA, CNEP e CEIS (ponto 1); parecer obrigatório da ASSJUR (ponto 2); ratificação pelo Diretor-Presidente (ponto 8); exceções à DDI sem base normativa (ponto 9); justificativa do preço e razão da escolha do fornecedor (ponto 10).</w:t>
+        <w:t xml:space="preserve">consulta a SIGA, CNEP e CEIS (ponto 1); parecer obrigatório da ASSJUR (ponto 2); ratificação pelo Diretor-Presidente (ponto 9); exceções à DDI sem base normativa (ponto 10); justificativa do preço e razão da escolha do fornecedor (ponto 11).</w:t>
       </w:r>
     </w:p>
     <w:p>
@@ -1136,7 +1136,7 @@
                 <w:sz w:val="18"/>
                 <w:szCs w:val="18"/>
               </w:rPr>
-              <w:t xml:space="preserve">A DDI passa a ser feita "de acordo com o valor", sem dizer qual. Saem os critérios de alto grau de risco de integridade e de Política de Alçada, e o Relatório deixa de trazer "medidas a serem adotadas".</w:t>
+              <w:t xml:space="preserve">A DDI passa a ser feita "de acordo com o valor", sem definir o valor. O POP vigente remetia o valor à Política de Alçada, ainda "em elaboração", e a proposta não remete a nenhum documento. Saem também os critérios de alto grau de risco de integridade, e o Relatório deixa de trazer "medidas a serem adotadas".</w:t>
             </w:r>
           </w:p>
         </w:tc>
@@ -1200,7 +1200,7 @@
                 <w:sz w:val="18"/>
                 <w:szCs w:val="18"/>
               </w:rPr>
-              <w:t xml:space="preserve">Definir o critério que torna a DDI obrigatória (o valor ou o ato que o fixe) e manter, no Relatório, as medidas a adotar.</w:t>
+              <w:t xml:space="preserve">Definir o critério que torna a DDI obrigatória (o valor ou o documento que o fixe) e manter, no Relatório, as medidas a adotar.</w:t>
             </w:r>
           </w:p>
         </w:tc>
@@ -1334,7 +1334,7 @@
                 <w:sz w:val="18"/>
                 <w:szCs w:val="18"/>
               </w:rPr>
-              <w:t xml:space="preserve">A proposta pede ao fornecedor o formulário de avaliação do Programa de Integridade antes da contratação e não diz se valor e prazo são cumulativos. A Lei 7.753 dá 180 dias depois da assinatura para implantar o programa e, antes disso, pede só a declaração de quem já o possui.</w:t>
+              <w:t xml:space="preserve">A proposta pede ao fornecedor o formulário de avaliação do Programa de Integridade antes da contratação e não diz se valor e prazo são cumulativos. A Lei 7.753 não exige o programa antes de contratar: o contratado tem até 180 dias, contados da celebração do contrato, para implantá-lo (art. 5º). Só quem já o possui apresenta, no momento da contratação, declaração de sua existência (art. 10).</w:t>
             </w:r>
           </w:p>
         </w:tc>
@@ -1667,6 +1667,204 @@
                 <w:szCs w:val="18"/>
               </w:rPr>
               <w:t xml:space="preserve">7</w:t>
+            </w:r>
+          </w:p>
+        </w:tc>
+        <w:tc>
+          <w:tcPr>
+            <w:tcW w:type="dxa" w:w="1900"/>
+            <w:tcBorders>
+              <w:top w:val="single" w:color="A6A6A6" w:sz="4"/>
+              <w:left w:val="single" w:color="A6A6A6" w:sz="4"/>
+              <w:bottom w:val="single" w:color="A6A6A6" w:sz="4"/>
+              <w:right w:val="single" w:color="A6A6A6" w:sz="4"/>
+            </w:tcBorders>
+            <w:tcMar>
+              <w:top w:type="dxa" w:w="60"/>
+              <w:left w:type="dxa" w:w="90"/>
+              <w:bottom w:type="dxa" w:w="60"/>
+              <w:right w:type="dxa" w:w="90"/>
+            </w:tcMar>
+          </w:tcPr>
+          <w:p>
+            <w:pPr>
+              <w:spacing w:after="40"/>
+            </w:pPr>
+            <w:r>
+              <w:rPr>
+                <w:rFonts w:ascii="Arial" w:cs="Arial" w:eastAsia="Arial" w:hAnsi="Arial"/>
+                <w:b w:val="false"/>
+                <w:bCs w:val="false"/>
+                <w:sz w:val="18"/>
+                <w:szCs w:val="18"/>
+              </w:rPr>
+              <w:t xml:space="preserve">Proposta, item 3(b)</w:t>
+            </w:r>
+          </w:p>
+        </w:tc>
+        <w:tc>
+          <w:tcPr>
+            <w:tcW w:type="dxa" w:w="4700"/>
+            <w:tcBorders>
+              <w:top w:val="single" w:color="A6A6A6" w:sz="4"/>
+              <w:left w:val="single" w:color="A6A6A6" w:sz="4"/>
+              <w:bottom w:val="single" w:color="A6A6A6" w:sz="4"/>
+              <w:right w:val="single" w:color="A6A6A6" w:sz="4"/>
+            </w:tcBorders>
+            <w:tcMar>
+              <w:top w:type="dxa" w:w="60"/>
+              <w:left w:type="dxa" w:w="90"/>
+              <w:bottom w:type="dxa" w:w="60"/>
+              <w:right w:type="dxa" w:w="90"/>
+            </w:tcMar>
+          </w:tcPr>
+          <w:p>
+            <w:pPr>
+              <w:spacing w:after="40"/>
+            </w:pPr>
+            <w:r>
+              <w:rPr>
+                <w:rFonts w:ascii="Arial" w:cs="Arial" w:eastAsia="Arial" w:hAnsi="Arial"/>
+                <w:b w:val="false"/>
+                <w:bCs w:val="false"/>
+                <w:sz w:val="18"/>
+                <w:szCs w:val="18"/>
+              </w:rPr>
+              <w:t xml:space="preserve">Com risco de DDI médio ou alto, a proposta diz apenas "avaliar a necessidade de alertar" os diretores, sem registro da decisão. Além disso, a ASSGER não dispõe de ferramenta para atribuir grau de risco.</w:t>
+            </w:r>
+          </w:p>
+        </w:tc>
+        <w:tc>
+          <w:tcPr>
+            <w:tcW w:type="dxa" w:w="2700"/>
+            <w:tcBorders>
+              <w:top w:val="single" w:color="A6A6A6" w:sz="4"/>
+              <w:left w:val="single" w:color="A6A6A6" w:sz="4"/>
+              <w:bottom w:val="single" w:color="A6A6A6" w:sz="4"/>
+              <w:right w:val="single" w:color="A6A6A6" w:sz="4"/>
+            </w:tcBorders>
+            <w:tcMar>
+              <w:top w:type="dxa" w:w="60"/>
+              <w:left w:type="dxa" w:w="90"/>
+              <w:bottom w:type="dxa" w:w="60"/>
+              <w:right w:type="dxa" w:w="90"/>
+            </w:tcMar>
+          </w:tcPr>
+          <w:p>
+            <w:pPr>
+              <w:spacing w:after="40"/>
+            </w:pPr>
+            <w:r>
+              <w:rPr>
+                <w:rFonts w:ascii="Arial" w:cs="Arial" w:eastAsia="Arial" w:hAnsi="Arial"/>
+                <w:b w:val="false"/>
+                <w:bCs w:val="false"/>
+                <w:sz w:val="18"/>
+                <w:szCs w:val="18"/>
+              </w:rPr>
+              <w:t xml:space="preserve">Não há norma específica. Indiretas: RILC, art. 4º, V; Estatuto, art. 72, VI e VII.</w:t>
+            </w:r>
+          </w:p>
+        </w:tc>
+        <w:tc>
+          <w:tcPr>
+            <w:tcW w:type="dxa" w:w="3870"/>
+            <w:tcBorders>
+              <w:top w:val="single" w:color="A6A6A6" w:sz="4"/>
+              <w:left w:val="single" w:color="A6A6A6" w:sz="4"/>
+              <w:bottom w:val="single" w:color="A6A6A6" w:sz="4"/>
+              <w:right w:val="single" w:color="A6A6A6" w:sz="4"/>
+            </w:tcBorders>
+            <w:tcMar>
+              <w:top w:type="dxa" w:w="60"/>
+              <w:left w:type="dxa" w:w="90"/>
+              <w:bottom w:type="dxa" w:w="60"/>
+              <w:right w:type="dxa" w:w="90"/>
+            </w:tcMar>
+          </w:tcPr>
+          <w:p>
+            <w:pPr>
+              <w:spacing w:after="40"/>
+            </w:pPr>
+            <w:r>
+              <w:rPr>
+                <w:rFonts w:ascii="Arial" w:cs="Arial" w:eastAsia="Arial" w:hAnsi="Arial"/>
+                <w:b w:val="false"/>
+                <w:bCs w:val="false"/>
+                <w:sz w:val="18"/>
+                <w:szCs w:val="18"/>
+              </w:rPr>
+              <w:t xml:space="preserve">Condicionar este passo à contratação de ferramenta de classificação de risco. Tornar obrigatória a comunicação à Diretoria e registrar nos autos o aceite do risco e as medidas de mitigação.</w:t>
+            </w:r>
+          </w:p>
+        </w:tc>
+        <w:tc>
+          <w:tcPr>
+            <w:tcW w:type="dxa" w:w="900"/>
+            <w:tcBorders>
+              <w:top w:val="single" w:color="A6A6A6" w:sz="4"/>
+              <w:left w:val="single" w:color="A6A6A6" w:sz="4"/>
+              <w:bottom w:val="single" w:color="A6A6A6" w:sz="4"/>
+              <w:right w:val="single" w:color="A6A6A6" w:sz="4"/>
+            </w:tcBorders>
+            <w:shd w:fill="E2EFDA" w:color="auto" w:val="clear"/>
+            <w:tcMar>
+              <w:top w:type="dxa" w:w="60"/>
+              <w:left w:type="dxa" w:w="90"/>
+              <w:bottom w:type="dxa" w:w="60"/>
+              <w:right w:type="dxa" w:w="90"/>
+            </w:tcMar>
+          </w:tcPr>
+          <w:p>
+            <w:pPr>
+              <w:spacing w:after="40"/>
+            </w:pPr>
+            <w:r>
+              <w:rPr>
+                <w:rFonts w:ascii="Arial" w:cs="Arial" w:eastAsia="Arial" w:hAnsi="Arial"/>
+                <w:b/>
+                <w:bCs/>
+                <w:sz w:val="18"/>
+                <w:szCs w:val="18"/>
+              </w:rPr>
+              <w:t xml:space="preserve">Baixa</w:t>
+            </w:r>
+          </w:p>
+        </w:tc>
+      </w:tr>
+      <w:tr>
+        <w:trPr>
+          <w:cantSplit/>
+        </w:trPr>
+        <w:tc>
+          <w:tcPr>
+            <w:tcW w:type="dxa" w:w="500"/>
+            <w:tcBorders>
+              <w:top w:val="single" w:color="A6A6A6" w:sz="4"/>
+              <w:left w:val="single" w:color="A6A6A6" w:sz="4"/>
+              <w:bottom w:val="single" w:color="A6A6A6" w:sz="4"/>
+              <w:right w:val="single" w:color="A6A6A6" w:sz="4"/>
+            </w:tcBorders>
+            <w:tcMar>
+              <w:top w:type="dxa" w:w="60"/>
+              <w:left w:type="dxa" w:w="90"/>
+              <w:bottom w:type="dxa" w:w="60"/>
+              <w:right w:type="dxa" w:w="90"/>
+            </w:tcMar>
+          </w:tcPr>
+          <w:p>
+            <w:pPr>
+              <w:spacing w:after="40"/>
+            </w:pPr>
+            <w:r>
+              <w:rPr>
+                <w:rFonts w:ascii="Arial" w:cs="Arial" w:eastAsia="Arial" w:hAnsi="Arial"/>
+                <w:b w:val="false"/>
+                <w:bCs w:val="false"/>
+                <w:sz w:val="18"/>
+                <w:szCs w:val="18"/>
+              </w:rPr>
+              <w:t xml:space="preserve">8</w:t>
             </w:r>
           </w:p>
         </w:tc>
@@ -2126,7 +2324,7 @@
                 <w:sz w:val="18"/>
                 <w:szCs w:val="18"/>
               </w:rPr>
-              <w:t xml:space="preserve">8</w:t>
+              <w:t xml:space="preserve">9</w:t>
             </w:r>
           </w:p>
         </w:tc>
@@ -2324,7 +2522,7 @@
                 <w:sz w:val="18"/>
                 <w:szCs w:val="18"/>
               </w:rPr>
-              <w:t xml:space="preserve">9</w:t>
+              <w:t xml:space="preserve">10</w:t>
             </w:r>
           </w:p>
         </w:tc>
@@ -2420,7 +2618,7 @@
                 <w:sz w:val="18"/>
                 <w:szCs w:val="18"/>
               </w:rPr>
-              <w:t xml:space="preserve">Sem norma que ampare as exceções. A função de integridade está no Regimento, art. 18, no Estatuto, art. 72, e no Código de Conduta, seção 4.2.</w:t>
+              <w:t xml:space="preserve">O RILC não prevê exceções à DDI. A função de integridade está no Regimento, art. 18, no Estatuto, art. 72, e no Código de Conduta, seção 4.2.</w:t>
             </w:r>
           </w:p>
         </w:tc>
@@ -2452,7 +2650,7 @@
                 <w:sz w:val="18"/>
                 <w:szCs w:val="18"/>
               </w:rPr>
-              <w:t xml:space="preserve">Indicar a norma de cada exceção ou retirá-la. Dizer se "órgãos públicos" inclui empresas estatais.</w:t>
+              <w:t xml:space="preserve">Tornar obrigatória a DDI para todas as contratações até que o RILC seja alterado.</w:t>
             </w:r>
           </w:p>
         </w:tc>
@@ -2522,7 +2720,7 @@
                 <w:sz w:val="18"/>
                 <w:szCs w:val="18"/>
               </w:rPr>
-              <w:t xml:space="preserve">10</w:t>
+              <w:t xml:space="preserve">11</w:t>
             </w:r>
           </w:p>
         </w:tc>
@@ -2720,7 +2918,7 @@
                 <w:sz w:val="18"/>
                 <w:szCs w:val="18"/>
               </w:rPr>
-              <w:t xml:space="preserve">11</w:t>
+              <w:t xml:space="preserve">12</w:t>
             </w:r>
           </w:p>
         </w:tc>
@@ -2918,7 +3116,7 @@
                 <w:sz w:val="18"/>
                 <w:szCs w:val="18"/>
               </w:rPr>
-              <w:t xml:space="preserve">12</w:t>
+              <w:t xml:space="preserve">13</w:t>
             </w:r>
           </w:p>
         </w:tc>
@@ -3116,7 +3314,7 @@
                 <w:sz w:val="18"/>
                 <w:szCs w:val="18"/>
               </w:rPr>
-              <w:t xml:space="preserve">13</w:t>
+              <w:t xml:space="preserve">14</w:t>
             </w:r>
           </w:p>
         </w:tc>
@@ -3180,7 +3378,7 @@
                 <w:sz w:val="18"/>
                 <w:szCs w:val="18"/>
               </w:rPr>
-              <w:t xml:space="preserve">Só se prevê o extrato no DOERJ. Falta a publicação da íntegra do contrato no site da CENTRAL em até 30 dias.</w:t>
+              <w:t xml:space="preserve">Só se prevê o extrato no DOERJ. Faltam a publicação da íntegra do contrato no site da CENTRAL e no PNCP e o prazo de 30 dias.</w:t>
             </w:r>
           </w:p>
         </w:tc>
@@ -3212,7 +3410,7 @@
                 <w:sz w:val="18"/>
                 <w:szCs w:val="18"/>
               </w:rPr>
-              <w:t xml:space="preserve">RILC, art. 137.</w:t>
+              <w:t xml:space="preserve">RILC, art. 137 (DOERJ e site). PNCP: nenhuma das normas de referência o cita; confirmar a base.</w:t>
             </w:r>
           </w:p>
         </w:tc>
@@ -3244,7 +3442,7 @@
                 <w:sz w:val="18"/>
                 <w:szCs w:val="18"/>
               </w:rPr>
-              <w:t xml:space="preserve">Incluir a publicação no site, com prazo e responsável. Pelo Regimento, art. 30, a GERLIC prepara a matéria e a CHEGAB providencia a publicação.</w:t>
+              <w:t xml:space="preserve">Incluir as publicações, com prazo e responsável. Pelo Regimento, art. 30, a GERLIC prepara a matéria e a CHEGAB providencia a publicação.</w:t>
             </w:r>
           </w:p>
         </w:tc>
@@ -3314,7 +3512,7 @@
                 <w:sz w:val="18"/>
                 <w:szCs w:val="18"/>
               </w:rPr>
-              <w:t xml:space="preserve">14</w:t>
+              <w:t xml:space="preserve">15</w:t>
             </w:r>
           </w:p>
         </w:tc>
@@ -3512,7 +3710,7 @@
                 <w:sz w:val="18"/>
                 <w:szCs w:val="18"/>
               </w:rPr>
-              <w:t xml:space="preserve">15</w:t>
+              <w:t xml:space="preserve">16</w:t>
             </w:r>
           </w:p>
         </w:tc>
@@ -3674,6 +3872,600 @@
                 <w:szCs w:val="18"/>
               </w:rPr>
               <w:t xml:space="preserve">Média</w:t>
+            </w:r>
+          </w:p>
+        </w:tc>
+      </w:tr>
+      <w:tr>
+        <w:trPr>
+          <w:cantSplit/>
+        </w:trPr>
+        <w:tc>
+          <w:tcPr>
+            <w:tcW w:type="dxa" w:w="500"/>
+            <w:tcBorders>
+              <w:top w:val="single" w:color="A6A6A6" w:sz="4"/>
+              <w:left w:val="single" w:color="A6A6A6" w:sz="4"/>
+              <w:bottom w:val="single" w:color="A6A6A6" w:sz="4"/>
+              <w:right w:val="single" w:color="A6A6A6" w:sz="4"/>
+            </w:tcBorders>
+            <w:tcMar>
+              <w:top w:type="dxa" w:w="60"/>
+              <w:left w:type="dxa" w:w="90"/>
+              <w:bottom w:type="dxa" w:w="60"/>
+              <w:right w:type="dxa" w:w="90"/>
+            </w:tcMar>
+          </w:tcPr>
+          <w:p>
+            <w:pPr>
+              <w:spacing w:after="40"/>
+            </w:pPr>
+            <w:r>
+              <w:rPr>
+                <w:rFonts w:ascii="Arial" w:cs="Arial" w:eastAsia="Arial" w:hAnsi="Arial"/>
+                <w:b w:val="false"/>
+                <w:bCs w:val="false"/>
+                <w:sz w:val="18"/>
+                <w:szCs w:val="18"/>
+              </w:rPr>
+              <w:t xml:space="preserve">17</w:t>
+            </w:r>
+          </w:p>
+        </w:tc>
+        <w:tc>
+          <w:tcPr>
+            <w:tcW w:type="dxa" w:w="1900"/>
+            <w:tcBorders>
+              <w:top w:val="single" w:color="A6A6A6" w:sz="4"/>
+              <w:left w:val="single" w:color="A6A6A6" w:sz="4"/>
+              <w:bottom w:val="single" w:color="A6A6A6" w:sz="4"/>
+              <w:right w:val="single" w:color="A6A6A6" w:sz="4"/>
+            </w:tcBorders>
+            <w:tcMar>
+              <w:top w:type="dxa" w:w="60"/>
+              <w:left w:type="dxa" w:w="90"/>
+              <w:bottom w:type="dxa" w:w="60"/>
+              <w:right w:type="dxa" w:w="90"/>
+            </w:tcMar>
+          </w:tcPr>
+          <w:p>
+            <w:pPr>
+              <w:spacing w:after="40"/>
+            </w:pPr>
+            <w:r>
+              <w:rPr>
+                <w:rFonts w:ascii="Arial" w:cs="Arial" w:eastAsia="Arial" w:hAnsi="Arial"/>
+                <w:b w:val="false"/>
+                <w:bCs w:val="false"/>
+                <w:sz w:val="18"/>
+                <w:szCs w:val="18"/>
+              </w:rPr>
+              <w:t xml:space="preserve">POP vigente e proposta (sem etapa)</w:t>
+            </w:r>
+          </w:p>
+        </w:tc>
+        <w:tc>
+          <w:tcPr>
+            <w:tcW w:type="dxa" w:w="4700"/>
+            <w:tcBorders>
+              <w:top w:val="single" w:color="A6A6A6" w:sz="4"/>
+              <w:left w:val="single" w:color="A6A6A6" w:sz="4"/>
+              <w:bottom w:val="single" w:color="A6A6A6" w:sz="4"/>
+              <w:right w:val="single" w:color="A6A6A6" w:sz="4"/>
+            </w:tcBorders>
+            <w:tcMar>
+              <w:top w:type="dxa" w:w="60"/>
+              <w:left w:type="dxa" w:w="90"/>
+              <w:bottom w:type="dxa" w:w="60"/>
+              <w:right w:type="dxa" w:w="90"/>
+            </w:tcMar>
+          </w:tcPr>
+          <w:p>
+            <w:pPr>
+              <w:spacing w:after="40"/>
+            </w:pPr>
+            <w:r>
+              <w:rPr>
+                <w:rFonts w:ascii="Arial" w:cs="Arial" w:eastAsia="Arial" w:hAnsi="Arial"/>
+                <w:b w:val="false"/>
+                <w:bCs w:val="false"/>
+                <w:sz w:val="18"/>
+                <w:szCs w:val="18"/>
+              </w:rPr>
+              <w:t xml:space="preserve">O POP não trata da garantia de execução do contrato. A garantia é facultativa, mas, quando exigida, deve ser apresentada no ato da assinatura, sob pena de multa, e tem limite de 5% do valor (10% em contratos de grande vulto).</w:t>
+            </w:r>
+          </w:p>
+        </w:tc>
+        <w:tc>
+          <w:tcPr>
+            <w:tcW w:type="dxa" w:w="2700"/>
+            <w:tcBorders>
+              <w:top w:val="single" w:color="A6A6A6" w:sz="4"/>
+              <w:left w:val="single" w:color="A6A6A6" w:sz="4"/>
+              <w:bottom w:val="single" w:color="A6A6A6" w:sz="4"/>
+              <w:right w:val="single" w:color="A6A6A6" w:sz="4"/>
+            </w:tcBorders>
+            <w:tcMar>
+              <w:top w:type="dxa" w:w="60"/>
+              <w:left w:type="dxa" w:w="90"/>
+              <w:bottom w:type="dxa" w:w="60"/>
+              <w:right w:type="dxa" w:w="90"/>
+            </w:tcMar>
+          </w:tcPr>
+          <w:p>
+            <w:pPr>
+              <w:spacing w:after="40"/>
+            </w:pPr>
+            <w:r>
+              <w:rPr>
+                <w:rFonts w:ascii="Arial" w:cs="Arial" w:eastAsia="Arial" w:hAnsi="Arial"/>
+                <w:b w:val="false"/>
+                <w:bCs w:val="false"/>
+                <w:sz w:val="18"/>
+                <w:szCs w:val="18"/>
+              </w:rPr>
+              <w:t xml:space="preserve">Lei 13.303/2016, art. 70; RILC, arts. 145 a 148.</w:t>
+            </w:r>
+          </w:p>
+        </w:tc>
+        <w:tc>
+          <w:tcPr>
+            <w:tcW w:type="dxa" w:w="3870"/>
+            <w:tcBorders>
+              <w:top w:val="single" w:color="A6A6A6" w:sz="4"/>
+              <w:left w:val="single" w:color="A6A6A6" w:sz="4"/>
+              <w:bottom w:val="single" w:color="A6A6A6" w:sz="4"/>
+              <w:right w:val="single" w:color="A6A6A6" w:sz="4"/>
+            </w:tcBorders>
+            <w:tcMar>
+              <w:top w:type="dxa" w:w="60"/>
+              <w:left w:type="dxa" w:w="90"/>
+              <w:bottom w:type="dxa" w:w="60"/>
+              <w:right w:type="dxa" w:w="90"/>
+            </w:tcMar>
+          </w:tcPr>
+          <w:p>
+            <w:pPr>
+              <w:spacing w:after="40"/>
+            </w:pPr>
+            <w:r>
+              <w:rPr>
+                <w:rFonts w:ascii="Arial" w:cs="Arial" w:eastAsia="Arial" w:hAnsi="Arial"/>
+                <w:b w:val="false"/>
+                <w:bCs w:val="false"/>
+                <w:sz w:val="18"/>
+                <w:szCs w:val="18"/>
+              </w:rPr>
+              <w:t xml:space="preserve">Prever a verificação da garantia: registrar se foi exigida no contrato e, quando exigida, conferir sua apresentação no ato da assinatura. Nos contratos de terceirização com dedicação exclusiva de mão de obra, prever a regra do art. 147 do RILC.</w:t>
+            </w:r>
+          </w:p>
+        </w:tc>
+        <w:tc>
+          <w:tcPr>
+            <w:tcW w:type="dxa" w:w="900"/>
+            <w:tcBorders>
+              <w:top w:val="single" w:color="A6A6A6" w:sz="4"/>
+              <w:left w:val="single" w:color="A6A6A6" w:sz="4"/>
+              <w:bottom w:val="single" w:color="A6A6A6" w:sz="4"/>
+              <w:right w:val="single" w:color="A6A6A6" w:sz="4"/>
+            </w:tcBorders>
+            <w:shd w:fill="FFE699" w:color="auto" w:val="clear"/>
+            <w:tcMar>
+              <w:top w:type="dxa" w:w="60"/>
+              <w:left w:type="dxa" w:w="90"/>
+              <w:bottom w:type="dxa" w:w="60"/>
+              <w:right w:type="dxa" w:w="90"/>
+            </w:tcMar>
+          </w:tcPr>
+          <w:p>
+            <w:pPr>
+              <w:spacing w:after="40"/>
+            </w:pPr>
+            <w:r>
+              <w:rPr>
+                <w:rFonts w:ascii="Arial" w:cs="Arial" w:eastAsia="Arial" w:hAnsi="Arial"/>
+                <w:b/>
+                <w:bCs/>
+                <w:sz w:val="18"/>
+                <w:szCs w:val="18"/>
+              </w:rPr>
+              <w:t xml:space="preserve">Média</w:t>
+            </w:r>
+          </w:p>
+        </w:tc>
+      </w:tr>
+      <w:tr>
+        <w:trPr>
+          <w:cantSplit/>
+        </w:trPr>
+        <w:tc>
+          <w:tcPr>
+            <w:tcW w:type="dxa" w:w="500"/>
+            <w:tcBorders>
+              <w:top w:val="single" w:color="A6A6A6" w:sz="4"/>
+              <w:left w:val="single" w:color="A6A6A6" w:sz="4"/>
+              <w:bottom w:val="single" w:color="A6A6A6" w:sz="4"/>
+              <w:right w:val="single" w:color="A6A6A6" w:sz="4"/>
+            </w:tcBorders>
+            <w:tcMar>
+              <w:top w:type="dxa" w:w="60"/>
+              <w:left w:type="dxa" w:w="90"/>
+              <w:bottom w:type="dxa" w:w="60"/>
+              <w:right w:type="dxa" w:w="90"/>
+            </w:tcMar>
+          </w:tcPr>
+          <w:p>
+            <w:pPr>
+              <w:spacing w:after="40"/>
+            </w:pPr>
+            <w:r>
+              <w:rPr>
+                <w:rFonts w:ascii="Arial" w:cs="Arial" w:eastAsia="Arial" w:hAnsi="Arial"/>
+                <w:b w:val="false"/>
+                <w:bCs w:val="false"/>
+                <w:sz w:val="18"/>
+                <w:szCs w:val="18"/>
+              </w:rPr>
+              <w:t xml:space="preserve">18</w:t>
+            </w:r>
+          </w:p>
+        </w:tc>
+        <w:tc>
+          <w:tcPr>
+            <w:tcW w:type="dxa" w:w="1900"/>
+            <w:tcBorders>
+              <w:top w:val="single" w:color="A6A6A6" w:sz="4"/>
+              <w:left w:val="single" w:color="A6A6A6" w:sz="4"/>
+              <w:bottom w:val="single" w:color="A6A6A6" w:sz="4"/>
+              <w:right w:val="single" w:color="A6A6A6" w:sz="4"/>
+            </w:tcBorders>
+            <w:tcMar>
+              <w:top w:type="dxa" w:w="60"/>
+              <w:left w:type="dxa" w:w="90"/>
+              <w:bottom w:type="dxa" w:w="60"/>
+              <w:right w:type="dxa" w:w="90"/>
+            </w:tcMar>
+          </w:tcPr>
+          <w:p>
+            <w:pPr>
+              <w:spacing w:after="40"/>
+            </w:pPr>
+            <w:r>
+              <w:rPr>
+                <w:rFonts w:ascii="Arial" w:cs="Arial" w:eastAsia="Arial" w:hAnsi="Arial"/>
+                <w:b w:val="false"/>
+                <w:bCs w:val="false"/>
+                <w:sz w:val="18"/>
+                <w:szCs w:val="18"/>
+              </w:rPr>
+              <w:t xml:space="preserve">POP vigente, A.13. Proposta, itens 3(c) e 6(e)</w:t>
+            </w:r>
+          </w:p>
+        </w:tc>
+        <w:tc>
+          <w:tcPr>
+            <w:tcW w:type="dxa" w:w="4700"/>
+            <w:tcBorders>
+              <w:top w:val="single" w:color="A6A6A6" w:sz="4"/>
+              <w:left w:val="single" w:color="A6A6A6" w:sz="4"/>
+              <w:bottom w:val="single" w:color="A6A6A6" w:sz="4"/>
+              <w:right w:val="single" w:color="A6A6A6" w:sz="4"/>
+            </w:tcBorders>
+            <w:tcMar>
+              <w:top w:type="dxa" w:w="60"/>
+              <w:left w:type="dxa" w:w="90"/>
+              <w:bottom w:type="dxa" w:w="60"/>
+              <w:right w:type="dxa" w:w="90"/>
+            </w:tcMar>
+          </w:tcPr>
+          <w:p>
+            <w:pPr>
+              <w:spacing w:after="40"/>
+            </w:pPr>
+            <w:r>
+              <w:rPr>
+                <w:rFonts w:ascii="Arial" w:cs="Arial" w:eastAsia="Arial" w:hAnsi="Arial"/>
+                <w:b w:val="false"/>
+                <w:bCs w:val="false"/>
+                <w:sz w:val="18"/>
+                <w:szCs w:val="18"/>
+              </w:rPr>
+              <w:t xml:space="preserve">Quando a área decide não acolher alguma recomendação da ASSJUR, o POP prevê a justificativa, mas não a ratificação dela pelo Diretor-Presidente.</w:t>
+            </w:r>
+          </w:p>
+        </w:tc>
+        <w:tc>
+          <w:tcPr>
+            <w:tcW w:type="dxa" w:w="2700"/>
+            <w:tcBorders>
+              <w:top w:val="single" w:color="A6A6A6" w:sz="4"/>
+              <w:left w:val="single" w:color="A6A6A6" w:sz="4"/>
+              <w:bottom w:val="single" w:color="A6A6A6" w:sz="4"/>
+              <w:right w:val="single" w:color="A6A6A6" w:sz="4"/>
+            </w:tcBorders>
+            <w:tcMar>
+              <w:top w:type="dxa" w:w="60"/>
+              <w:left w:type="dxa" w:w="90"/>
+              <w:bottom w:type="dxa" w:w="60"/>
+              <w:right w:type="dxa" w:w="90"/>
+            </w:tcMar>
+          </w:tcPr>
+          <w:p>
+            <w:pPr>
+              <w:spacing w:after="40"/>
+            </w:pPr>
+            <w:r>
+              <w:rPr>
+                <w:rFonts w:ascii="Arial" w:cs="Arial" w:eastAsia="Arial" w:hAnsi="Arial"/>
+                <w:b w:val="false"/>
+                <w:bCs w:val="false"/>
+                <w:sz w:val="18"/>
+                <w:szCs w:val="18"/>
+              </w:rPr>
+              <w:t xml:space="preserve">RILC, art. 33, §1º (regra do edital, aplicada por analogia).</w:t>
+            </w:r>
+          </w:p>
+        </w:tc>
+        <w:tc>
+          <w:tcPr>
+            <w:tcW w:type="dxa" w:w="3870"/>
+            <w:tcBorders>
+              <w:top w:val="single" w:color="A6A6A6" w:sz="4"/>
+              <w:left w:val="single" w:color="A6A6A6" w:sz="4"/>
+              <w:bottom w:val="single" w:color="A6A6A6" w:sz="4"/>
+              <w:right w:val="single" w:color="A6A6A6" w:sz="4"/>
+            </w:tcBorders>
+            <w:tcMar>
+              <w:top w:type="dxa" w:w="60"/>
+              <w:left w:type="dxa" w:w="90"/>
+              <w:bottom w:type="dxa" w:w="60"/>
+              <w:right w:type="dxa" w:w="90"/>
+            </w:tcMar>
+          </w:tcPr>
+          <w:p>
+            <w:pPr>
+              <w:spacing w:after="40"/>
+            </w:pPr>
+            <w:r>
+              <w:rPr>
+                <w:rFonts w:ascii="Arial" w:cs="Arial" w:eastAsia="Arial" w:hAnsi="Arial"/>
+                <w:b w:val="false"/>
+                <w:bCs w:val="false"/>
+                <w:sz w:val="18"/>
+                <w:szCs w:val="18"/>
+              </w:rPr>
+              <w:t xml:space="preserve">Prever a justificativa técnica da área, ratificada pelo Diretor-Presidente, juntada antes da manifestação da SUPADM.</w:t>
+            </w:r>
+          </w:p>
+        </w:tc>
+        <w:tc>
+          <w:tcPr>
+            <w:tcW w:type="dxa" w:w="900"/>
+            <w:tcBorders>
+              <w:top w:val="single" w:color="A6A6A6" w:sz="4"/>
+              <w:left w:val="single" w:color="A6A6A6" w:sz="4"/>
+              <w:bottom w:val="single" w:color="A6A6A6" w:sz="4"/>
+              <w:right w:val="single" w:color="A6A6A6" w:sz="4"/>
+            </w:tcBorders>
+            <w:shd w:fill="E2EFDA" w:color="auto" w:val="clear"/>
+            <w:tcMar>
+              <w:top w:type="dxa" w:w="60"/>
+              <w:left w:type="dxa" w:w="90"/>
+              <w:bottom w:type="dxa" w:w="60"/>
+              <w:right w:type="dxa" w:w="90"/>
+            </w:tcMar>
+          </w:tcPr>
+          <w:p>
+            <w:pPr>
+              <w:spacing w:after="40"/>
+            </w:pPr>
+            <w:r>
+              <w:rPr>
+                <w:rFonts w:ascii="Arial" w:cs="Arial" w:eastAsia="Arial" w:hAnsi="Arial"/>
+                <w:b/>
+                <w:bCs/>
+                <w:sz w:val="18"/>
+                <w:szCs w:val="18"/>
+              </w:rPr>
+              <w:t xml:space="preserve">Baixa</w:t>
+            </w:r>
+          </w:p>
+        </w:tc>
+      </w:tr>
+      <w:tr>
+        <w:trPr>
+          <w:cantSplit/>
+        </w:trPr>
+        <w:tc>
+          <w:tcPr>
+            <w:tcW w:type="dxa" w:w="500"/>
+            <w:tcBorders>
+              <w:top w:val="single" w:color="A6A6A6" w:sz="4"/>
+              <w:left w:val="single" w:color="A6A6A6" w:sz="4"/>
+              <w:bottom w:val="single" w:color="A6A6A6" w:sz="4"/>
+              <w:right w:val="single" w:color="A6A6A6" w:sz="4"/>
+            </w:tcBorders>
+            <w:tcMar>
+              <w:top w:type="dxa" w:w="60"/>
+              <w:left w:type="dxa" w:w="90"/>
+              <w:bottom w:type="dxa" w:w="60"/>
+              <w:right w:type="dxa" w:w="90"/>
+            </w:tcMar>
+          </w:tcPr>
+          <w:p>
+            <w:pPr>
+              <w:spacing w:after="40"/>
+            </w:pPr>
+            <w:r>
+              <w:rPr>
+                <w:rFonts w:ascii="Arial" w:cs="Arial" w:eastAsia="Arial" w:hAnsi="Arial"/>
+                <w:b w:val="false"/>
+                <w:bCs w:val="false"/>
+                <w:sz w:val="18"/>
+                <w:szCs w:val="18"/>
+              </w:rPr>
+              <w:t xml:space="preserve">19</w:t>
+            </w:r>
+          </w:p>
+        </w:tc>
+        <w:tc>
+          <w:tcPr>
+            <w:tcW w:type="dxa" w:w="1900"/>
+            <w:tcBorders>
+              <w:top w:val="single" w:color="A6A6A6" w:sz="4"/>
+              <w:left w:val="single" w:color="A6A6A6" w:sz="4"/>
+              <w:bottom w:val="single" w:color="A6A6A6" w:sz="4"/>
+              <w:right w:val="single" w:color="A6A6A6" w:sz="4"/>
+            </w:tcBorders>
+            <w:tcMar>
+              <w:top w:type="dxa" w:w="60"/>
+              <w:left w:type="dxa" w:w="90"/>
+              <w:bottom w:type="dxa" w:w="60"/>
+              <w:right w:type="dxa" w:w="90"/>
+            </w:tcMar>
+          </w:tcPr>
+          <w:p>
+            <w:pPr>
+              <w:spacing w:after="40"/>
+            </w:pPr>
+            <w:r>
+              <w:rPr>
+                <w:rFonts w:ascii="Arial" w:cs="Arial" w:eastAsia="Arial" w:hAnsi="Arial"/>
+                <w:b w:val="false"/>
+                <w:bCs w:val="false"/>
+                <w:sz w:val="18"/>
+                <w:szCs w:val="18"/>
+              </w:rPr>
+              <w:t xml:space="preserve">POP vigente, A.8(b). Proposta, item 1(d)</w:t>
+            </w:r>
+          </w:p>
+        </w:tc>
+        <w:tc>
+          <w:tcPr>
+            <w:tcW w:type="dxa" w:w="4700"/>
+            <w:tcBorders>
+              <w:top w:val="single" w:color="A6A6A6" w:sz="4"/>
+              <w:left w:val="single" w:color="A6A6A6" w:sz="4"/>
+              <w:bottom w:val="single" w:color="A6A6A6" w:sz="4"/>
+              <w:right w:val="single" w:color="A6A6A6" w:sz="4"/>
+            </w:tcBorders>
+            <w:tcMar>
+              <w:top w:type="dxa" w:w="60"/>
+              <w:left w:type="dxa" w:w="90"/>
+              <w:bottom w:type="dxa" w:w="60"/>
+              <w:right w:type="dxa" w:w="90"/>
+            </w:tcMar>
+          </w:tcPr>
+          <w:p>
+            <w:pPr>
+              <w:spacing w:after="40"/>
+            </w:pPr>
+            <w:r>
+              <w:rPr>
+                <w:rFonts w:ascii="Arial" w:cs="Arial" w:eastAsia="Arial" w:hAnsi="Arial"/>
+                <w:b w:val="false"/>
+                <w:bCs w:val="false"/>
+                <w:sz w:val="18"/>
+                <w:szCs w:val="18"/>
+              </w:rPr>
+              <w:t xml:space="preserve">O formulário de avaliação do Programa de Integridade é definido em outro procedimento (Portaria CENTRAL 188/2021). A lei fixa 16 parâmetros de avaliação e exige que a aferição seja feita por prova documental, sem interferência na gestão da empresa.</w:t>
+            </w:r>
+          </w:p>
+        </w:tc>
+        <w:tc>
+          <w:tcPr>
+            <w:tcW w:type="dxa" w:w="2700"/>
+            <w:tcBorders>
+              <w:top w:val="single" w:color="A6A6A6" w:sz="4"/>
+              <w:left w:val="single" w:color="A6A6A6" w:sz="4"/>
+              <w:bottom w:val="single" w:color="A6A6A6" w:sz="4"/>
+              <w:right w:val="single" w:color="A6A6A6" w:sz="4"/>
+            </w:tcBorders>
+            <w:tcMar>
+              <w:top w:type="dxa" w:w="60"/>
+              <w:left w:type="dxa" w:w="90"/>
+              <w:bottom w:type="dxa" w:w="60"/>
+              <w:right w:type="dxa" w:w="90"/>
+            </w:tcMar>
+          </w:tcPr>
+          <w:p>
+            <w:pPr>
+              <w:spacing w:after="40"/>
+            </w:pPr>
+            <w:r>
+              <w:rPr>
+                <w:rFonts w:ascii="Arial" w:cs="Arial" w:eastAsia="Arial" w:hAnsi="Arial"/>
+                <w:b w:val="false"/>
+                <w:bCs w:val="false"/>
+                <w:sz w:val="18"/>
+                <w:szCs w:val="18"/>
+              </w:rPr>
+              <w:t xml:space="preserve">Lei 7.753/2017, art. 4º e art. 11, §2º.</w:t>
+            </w:r>
+          </w:p>
+        </w:tc>
+        <w:tc>
+          <w:tcPr>
+            <w:tcW w:type="dxa" w:w="3870"/>
+            <w:tcBorders>
+              <w:top w:val="single" w:color="A6A6A6" w:sz="4"/>
+              <w:left w:val="single" w:color="A6A6A6" w:sz="4"/>
+              <w:bottom w:val="single" w:color="A6A6A6" w:sz="4"/>
+              <w:right w:val="single" w:color="A6A6A6" w:sz="4"/>
+            </w:tcBorders>
+            <w:tcMar>
+              <w:top w:type="dxa" w:w="60"/>
+              <w:left w:type="dxa" w:w="90"/>
+              <w:bottom w:type="dxa" w:w="60"/>
+              <w:right w:type="dxa" w:w="90"/>
+            </w:tcMar>
+          </w:tcPr>
+          <w:p>
+            <w:pPr>
+              <w:spacing w:after="40"/>
+            </w:pPr>
+            <w:r>
+              <w:rPr>
+                <w:rFonts w:ascii="Arial" w:cs="Arial" w:eastAsia="Arial" w:hAnsi="Arial"/>
+                <w:b w:val="false"/>
+                <w:bCs w:val="false"/>
+                <w:sz w:val="18"/>
+                <w:szCs w:val="18"/>
+              </w:rPr>
+              <w:t xml:space="preserve">Confirmar que a Portaria CENTRAL 188/2021 e o formulário seguem os 16 parâmetros do art. 4º.</w:t>
+            </w:r>
+          </w:p>
+        </w:tc>
+        <w:tc>
+          <w:tcPr>
+            <w:tcW w:type="dxa" w:w="900"/>
+            <w:tcBorders>
+              <w:top w:val="single" w:color="A6A6A6" w:sz="4"/>
+              <w:left w:val="single" w:color="A6A6A6" w:sz="4"/>
+              <w:bottom w:val="single" w:color="A6A6A6" w:sz="4"/>
+              <w:right w:val="single" w:color="A6A6A6" w:sz="4"/>
+            </w:tcBorders>
+            <w:shd w:fill="E2EFDA" w:color="auto" w:val="clear"/>
+            <w:tcMar>
+              <w:top w:type="dxa" w:w="60"/>
+              <w:left w:type="dxa" w:w="90"/>
+              <w:bottom w:type="dxa" w:w="60"/>
+              <w:right w:type="dxa" w:w="90"/>
+            </w:tcMar>
+          </w:tcPr>
+          <w:p>
+            <w:pPr>
+              <w:spacing w:after="40"/>
+            </w:pPr>
+            <w:r>
+              <w:rPr>
+                <w:rFonts w:ascii="Arial" w:cs="Arial" w:eastAsia="Arial" w:hAnsi="Arial"/>
+                <w:b/>
+                <w:bCs/>
+                <w:sz w:val="18"/>
+                <w:szCs w:val="18"/>
+              </w:rPr>
+              <w:t xml:space="preserve">Baixa</w:t>
             </w:r>
           </w:p>
         </w:tc>
@@ -3864,7 +4656,7 @@
                 <w:sz w:val="18"/>
                 <w:szCs w:val="18"/>
               </w:rPr>
-              <w:t xml:space="preserve">A Minuta submete todos os interessados em iniciar ou manter relacionamento com a CENTRAL a diligências de integridade, sem exceção à realização da DDI. As quatro exceções do POP (ponto 9) deixariam de ter amparo.</w:t>
+              <w:t xml:space="preserve">A Minuta submete todos os interessados em iniciar ou manter relacionamento com a CENTRAL a diligências de integridade, sem exceção à realização da DDI. As quatro exceções do POP (ponto 10) deixariam de ter amparo. Isso converge com a recomendação do ponto 10.</w:t>
             </w:r>
           </w:p>
         </w:tc>
@@ -3934,6 +4726,75 @@
                 <w:szCs w:val="18"/>
               </w:rPr>
               <w:t xml:space="preserve">Quem receber grau de risco alto não poderá participar de procedimentos de contratação, salvo exceções previstas em norma interna. O POP precisará tratar esse impedimento.</w:t>
+            </w:r>
+          </w:p>
+        </w:tc>
+      </w:tr>
+      <w:tr>
+        <w:trPr>
+          <w:cantSplit/>
+        </w:trPr>
+        <w:tc>
+          <w:tcPr>
+            <w:tcW w:type="dxa" w:w="2800"/>
+            <w:tcBorders>
+              <w:top w:val="single" w:color="A6A6A6" w:sz="4"/>
+              <w:left w:val="single" w:color="A6A6A6" w:sz="4"/>
+              <w:bottom w:val="single" w:color="A6A6A6" w:sz="4"/>
+              <w:right w:val="single" w:color="A6A6A6" w:sz="4"/>
+            </w:tcBorders>
+            <w:tcMar>
+              <w:top w:type="dxa" w:w="60"/>
+              <w:left w:type="dxa" w:w="90"/>
+              <w:bottom w:type="dxa" w:w="60"/>
+              <w:right w:type="dxa" w:w="90"/>
+            </w:tcMar>
+          </w:tcPr>
+          <w:p>
+            <w:pPr>
+              <w:spacing w:after="40"/>
+            </w:pPr>
+            <w:r>
+              <w:rPr>
+                <w:rFonts w:ascii="Arial" w:cs="Arial" w:eastAsia="Arial" w:hAnsi="Arial"/>
+                <w:b w:val="false"/>
+                <w:bCs w:val="false"/>
+                <w:sz w:val="18"/>
+                <w:szCs w:val="18"/>
+              </w:rPr>
+              <w:t xml:space="preserve">Programa de Integridade na assinatura</w:t>
+            </w:r>
+          </w:p>
+        </w:tc>
+        <w:tc>
+          <w:tcPr>
+            <w:tcW w:type="dxa" w:w="11770"/>
+            <w:tcBorders>
+              <w:top w:val="single" w:color="A6A6A6" w:sz="4"/>
+              <w:left w:val="single" w:color="A6A6A6" w:sz="4"/>
+              <w:bottom w:val="single" w:color="A6A6A6" w:sz="4"/>
+              <w:right w:val="single" w:color="A6A6A6" w:sz="4"/>
+            </w:tcBorders>
+            <w:tcMar>
+              <w:top w:type="dxa" w:w="60"/>
+              <w:left w:type="dxa" w:w="90"/>
+              <w:bottom w:type="dxa" w:w="60"/>
+              <w:right w:type="dxa" w:w="90"/>
+            </w:tcMar>
+          </w:tcPr>
+          <w:p>
+            <w:pPr>
+              <w:spacing w:after="40"/>
+            </w:pPr>
+            <w:r>
+              <w:rPr>
+                <w:rFonts w:ascii="Arial" w:cs="Arial" w:eastAsia="Arial" w:hAnsi="Arial"/>
+                <w:b w:val="false"/>
+                <w:bCs w:val="false"/>
+                <w:sz w:val="18"/>
+                <w:szCs w:val="18"/>
+              </w:rPr>
+              <w:t xml:space="preserve">Na versão da Minuta de 29/07/2025 (art. 252, III), o contratado teria de comprovar que mantém Programa de Integridade, nos termos da Lei 7.753, como condição para assinar o contrato. A Lei 7.753 não faz essa exigência: o contratado tem até 180 dias, contados da celebração do contrato, para implantar o programa (art. 5º), e só quem já o possui apresenta declaração no momento da contratação (art. 10). Se mantida, a exigência contraria a lei e deve ser levada à ASSJUR. Esse dispositivo não consta na versão consolidada da Minuta.</w:t>
             </w:r>
           </w:p>
         </w:tc>
@@ -4766,7 +5627,7 @@
                 <w:sz w:val="18"/>
                 <w:szCs w:val="18"/>
               </w:rPr>
-              <w:t xml:space="preserve">Após aprovar o Planejamento no SIGA, clicar em "concluir"</w:t>
+              <w:t xml:space="preserve">CHEGAB: elaborar a minuta de Despacho de autorização da NAD (Anexo II) e encaminhar ao Diretor Presidente</w:t>
             </w:r>
           </w:p>
         </w:tc>
@@ -4798,7 +5659,7 @@
                 <w:sz w:val="18"/>
                 <w:szCs w:val="18"/>
               </w:rPr>
-              <w:t xml:space="preserve">B.4, item b</w:t>
+              <w:t xml:space="preserve">B.10</w:t>
             </w:r>
           </w:p>
         </w:tc>
@@ -4899,7 +5760,7 @@
                 <w:sz w:val="18"/>
                 <w:szCs w:val="18"/>
               </w:rPr>
-              <w:t xml:space="preserve">CHEGAB: elaborar a minuta de Despacho de autorização da NAD (Anexo II) e encaminhar ao Diretor Presidente</w:t>
+              <w:t xml:space="preserve">PRESI: assinar a minuta de Despacho (Anexo II)</w:t>
             </w:r>
           </w:p>
         </w:tc>
@@ -5032,7 +5893,7 @@
                 <w:sz w:val="18"/>
                 <w:szCs w:val="18"/>
               </w:rPr>
-              <w:t xml:space="preserve">PRESI: assinar a minuta de Despacho (Anexo II)</w:t>
+              <w:t xml:space="preserve">PRESI: autorizar a emissão da Nota de Empenho no SIGA e encaminhar à DIRPLA/GERORT (a redação vigente escreve "Nota de Empenho – NAD")</w:t>
             </w:r>
           </w:p>
         </w:tc>
@@ -5064,7 +5925,7 @@
                 <w:sz w:val="18"/>
                 <w:szCs w:val="18"/>
               </w:rPr>
-              <w:t xml:space="preserve">B.10</w:t>
+              <w:t xml:space="preserve">B.10, item b</w:t>
             </w:r>
           </w:p>
         </w:tc>
@@ -5096,7 +5957,7 @@
                 <w:sz w:val="18"/>
                 <w:szCs w:val="18"/>
               </w:rPr>
-              <w:t xml:space="preserve">Não consta.</w:t>
+              <w:t xml:space="preserve">Não consta. O item 5 da sugestão trata só da autorização da NAD.</w:t>
             </w:r>
           </w:p>
         </w:tc>
@@ -5165,7 +6026,7 @@
                 <w:sz w:val="18"/>
                 <w:szCs w:val="18"/>
               </w:rPr>
-              <w:t xml:space="preserve">PRESI: autorizar a emissão da Nota de Empenho no SIGA e encaminhar à DIRPLA/GERORT (a redação vigente escreve "Nota de Empenho – NAD")</w:t>
+              <w:t xml:space="preserve">GERORT/DIRPLA: emitir a Nota de Empenho (NE) como etapa própria</w:t>
             </w:r>
           </w:p>
         </w:tc>
@@ -5197,7 +6058,7 @@
                 <w:sz w:val="18"/>
                 <w:szCs w:val="18"/>
               </w:rPr>
-              <w:t xml:space="preserve">B.10, item b</w:t>
+              <w:t xml:space="preserve">B.11</w:t>
             </w:r>
           </w:p>
         </w:tc>
@@ -5229,7 +6090,7 @@
                 <w:sz w:val="18"/>
                 <w:szCs w:val="18"/>
               </w:rPr>
-              <w:t xml:space="preserve">Não consta. O item 5 da sugestão trata só da autorização da NAD.</w:t>
+              <w:t xml:space="preserve">Sem etapa nem responsável. A NE aparece apenas como dado do termo de contrato (6a) e, de passagem, como "NAD/Empenho" (3e).</w:t>
             </w:r>
           </w:p>
         </w:tc>
@@ -5267,139 +6128,6 @@
                 <w:szCs w:val="18"/>
               </w:rPr>
               <w:t xml:space="preserve">8</w:t>
-            </w:r>
-          </w:p>
-        </w:tc>
-        <w:tc>
-          <w:tcPr>
-            <w:tcW w:type="dxa" w:w="5000"/>
-            <w:tcBorders>
-              <w:top w:val="single" w:color="A6A6A6" w:sz="4"/>
-              <w:left w:val="single" w:color="A6A6A6" w:sz="4"/>
-              <w:bottom w:val="single" w:color="A6A6A6" w:sz="4"/>
-              <w:right w:val="single" w:color="A6A6A6" w:sz="4"/>
-            </w:tcBorders>
-            <w:tcMar>
-              <w:top w:type="dxa" w:w="60"/>
-              <w:left w:type="dxa" w:w="90"/>
-              <w:bottom w:type="dxa" w:w="60"/>
-              <w:right w:type="dxa" w:w="90"/>
-            </w:tcMar>
-          </w:tcPr>
-          <w:p>
-            <w:pPr>
-              <w:spacing w:after="40"/>
-            </w:pPr>
-            <w:r>
-              <w:rPr>
-                <w:rFonts w:ascii="Arial" w:cs="Arial" w:eastAsia="Arial" w:hAnsi="Arial"/>
-                <w:b w:val="false"/>
-                <w:bCs w:val="false"/>
-                <w:sz w:val="18"/>
-                <w:szCs w:val="18"/>
-              </w:rPr>
-              <w:t xml:space="preserve">GERORT/DIRPLA: emitir a Nota de Empenho (NE) como etapa própria</w:t>
-            </w:r>
-          </w:p>
-        </w:tc>
-        <w:tc>
-          <w:tcPr>
-            <w:tcW w:type="dxa" w:w="2000"/>
-            <w:tcBorders>
-              <w:top w:val="single" w:color="A6A6A6" w:sz="4"/>
-              <w:left w:val="single" w:color="A6A6A6" w:sz="4"/>
-              <w:bottom w:val="single" w:color="A6A6A6" w:sz="4"/>
-              <w:right w:val="single" w:color="A6A6A6" w:sz="4"/>
-            </w:tcBorders>
-            <w:tcMar>
-              <w:top w:type="dxa" w:w="60"/>
-              <w:left w:type="dxa" w:w="90"/>
-              <w:bottom w:type="dxa" w:w="60"/>
-              <w:right w:type="dxa" w:w="90"/>
-            </w:tcMar>
-          </w:tcPr>
-          <w:p>
-            <w:pPr>
-              <w:spacing w:after="40"/>
-            </w:pPr>
-            <w:r>
-              <w:rPr>
-                <w:rFonts w:ascii="Arial" w:cs="Arial" w:eastAsia="Arial" w:hAnsi="Arial"/>
-                <w:b w:val="false"/>
-                <w:bCs w:val="false"/>
-                <w:sz w:val="18"/>
-                <w:szCs w:val="18"/>
-              </w:rPr>
-              <w:t xml:space="preserve">B.11</w:t>
-            </w:r>
-          </w:p>
-        </w:tc>
-        <w:tc>
-          <w:tcPr>
-            <w:tcW w:type="dxa" w:w="7070"/>
-            <w:tcBorders>
-              <w:top w:val="single" w:color="A6A6A6" w:sz="4"/>
-              <w:left w:val="single" w:color="A6A6A6" w:sz="4"/>
-              <w:bottom w:val="single" w:color="A6A6A6" w:sz="4"/>
-              <w:right w:val="single" w:color="A6A6A6" w:sz="4"/>
-            </w:tcBorders>
-            <w:tcMar>
-              <w:top w:type="dxa" w:w="60"/>
-              <w:left w:type="dxa" w:w="90"/>
-              <w:bottom w:type="dxa" w:w="60"/>
-              <w:right w:type="dxa" w:w="90"/>
-            </w:tcMar>
-          </w:tcPr>
-          <w:p>
-            <w:pPr>
-              <w:spacing w:after="40"/>
-            </w:pPr>
-            <w:r>
-              <w:rPr>
-                <w:rFonts w:ascii="Arial" w:cs="Arial" w:eastAsia="Arial" w:hAnsi="Arial"/>
-                <w:b w:val="false"/>
-                <w:bCs w:val="false"/>
-                <w:sz w:val="18"/>
-                <w:szCs w:val="18"/>
-              </w:rPr>
-              <w:t xml:space="preserve">Sem etapa nem responsável. A NE aparece apenas como dado do termo de contrato (6a) e, de passagem, como "NAD/Empenho" (3e).</w:t>
-            </w:r>
-          </w:p>
-        </w:tc>
-      </w:tr>
-      <w:tr>
-        <w:trPr>
-          <w:cantSplit/>
-        </w:trPr>
-        <w:tc>
-          <w:tcPr>
-            <w:tcW w:type="dxa" w:w="500"/>
-            <w:tcBorders>
-              <w:top w:val="single" w:color="A6A6A6" w:sz="4"/>
-              <w:left w:val="single" w:color="A6A6A6" w:sz="4"/>
-              <w:bottom w:val="single" w:color="A6A6A6" w:sz="4"/>
-              <w:right w:val="single" w:color="A6A6A6" w:sz="4"/>
-            </w:tcBorders>
-            <w:tcMar>
-              <w:top w:type="dxa" w:w="60"/>
-              <w:left w:type="dxa" w:w="90"/>
-              <w:bottom w:type="dxa" w:w="60"/>
-              <w:right w:type="dxa" w:w="90"/>
-            </w:tcMar>
-          </w:tcPr>
-          <w:p>
-            <w:pPr>
-              <w:spacing w:after="40"/>
-            </w:pPr>
-            <w:r>
-              <w:rPr>
-                <w:rFonts w:ascii="Arial" w:cs="Arial" w:eastAsia="Arial" w:hAnsi="Arial"/>
-                <w:b w:val="false"/>
-                <w:bCs w:val="false"/>
-                <w:sz w:val="18"/>
-                <w:szCs w:val="18"/>
-              </w:rPr>
-              <w:t xml:space="preserve">9</w:t>
             </w:r>
           </w:p>
         </w:tc>
@@ -6202,7 +6930,7 @@
                 <w:sz w:val="18"/>
                 <w:szCs w:val="18"/>
               </w:rPr>
-              <w:t xml:space="preserve">1d (2º): "encaminhar [...] solicitando a realização do DDI, de acordo com o valor", sem definir o valor. A lista de exceções (abaixo de R$ 20.000,00, aditivo, ARP, órgãos públicos) foi mantida.</w:t>
+              <w:t xml:space="preserve">1d (2º): "encaminhar [...] solicitando a realização do DDI, de acordo com o valor", sem definir o valor. O POP vigente remetia o valor à Política de Alçada, ainda "em elaboração"; a proposta não remete a nenhum documento. A lista de exceções (abaixo de R$ 20.000,00, aditivo, ARP, órgãos públicos) foi mantida.</w:t>
             </w:r>
           </w:p>
         </w:tc>

</xml_diff>